<commit_message>
Paper: submission-ready -- authors, EDIA expansion, references, synthetic-domain fix
Adds the four authors (CSBS, MPSTME, NMIMS Mumbai) and expands EDIA on first use
via a single \EDIAfull macro. Removes the draft TODOs and acknowledgment
placeholder (e-mail addresses are the only markers left, for the authors to fill
in), completes reference pages/volumes, and turns the hard-coded Section V into a
\ref.

Fixes a factual error: the 139 synthetic pairs cover 79 topics, i.e. 8
organisational domains, not the 12 of the 120-topic plan (paper, explainer,
dataset card). build_docx.py now expands argument-less macros and numbers
section labels.
</commit_message>
<xml_diff>
--- a/paper/edia_ieee.docx
+++ b/paper/edia_ieee.docx
@@ -29,13 +29,15 @@
         <w:tblLook w:firstColumn="1" w:firstRow="1" w:lastColumn="0" w:lastRow="0" w:noHBand="0" w:noVBand="1" w:val="04A0"/>
       </w:tblPr>
       <w:tblGrid>
-        <w:gridCol w:w="5220"/>
-        <w:gridCol w:w="5220"/>
+        <w:gridCol w:w="2610"/>
+        <w:gridCol w:w="2610"/>
+        <w:gridCol w:w="2610"/>
+        <w:gridCol w:w="2610"/>
       </w:tblGrid>
       <w:tr>
         <w:tc>
           <w:tcPr>
-            <w:tcW w:type="dxa" w:w="5220"/>
+            <w:tcW w:type="dxa" w:w="2610"/>
           </w:tcPr>
           <w:p>
             <w:pPr>
@@ -57,35 +59,9 @@
               <w:rPr>
                 <w:rFonts w:ascii="Times New Roman" w:hAnsi="Times New Roman" w:eastAsia="Times New Roman"/>
                 <w:i/>
-                <w:color w:val="C00000"/>
                 <w:sz w:val="20"/>
               </w:rPr>
-              <w:t xml:space="preserve">[TODO: </w:t>
-            </w:r>
-            <w:r>
-              <w:rPr>
-                <w:rFonts w:ascii="Times New Roman" w:hAnsi="Times New Roman" w:eastAsia="Times New Roman"/>
-                <w:i/>
-                <w:color w:val="C00000"/>
-                <w:sz w:val="20"/>
-              </w:rPr>
-              <w:t>Department</w:t>
-            </w:r>
-            <w:r>
-              <w:rPr>
-                <w:rFonts w:ascii="Times New Roman" w:hAnsi="Times New Roman" w:eastAsia="Times New Roman"/>
-                <w:i/>
-                <w:color w:val="C00000"/>
-                <w:sz w:val="20"/>
-              </w:rPr>
-              <w:t>]</w:t>
-            </w:r>
-            <w:r>
-              <w:rPr>
-                <w:rFonts w:ascii="Times New Roman" w:hAnsi="Times New Roman" w:eastAsia="Times New Roman"/>
-                <w:i/>
-                <w:sz w:val="20"/>
-              </w:rPr>
+              <w:t>Dept. of Computer Science</w:t>
             </w:r>
           </w:p>
           <w:p>
@@ -96,28 +72,9 @@
               <w:rPr>
                 <w:rFonts w:ascii="Times New Roman" w:hAnsi="Times New Roman" w:eastAsia="Times New Roman"/>
                 <w:i/>
-                <w:color w:val="C00000"/>
                 <w:sz w:val="20"/>
               </w:rPr>
-              <w:t xml:space="preserve">[TODO: </w:t>
-            </w:r>
-            <w:r>
-              <w:rPr>
-                <w:rFonts w:ascii="Times New Roman" w:hAnsi="Times New Roman" w:eastAsia="Times New Roman"/>
-                <w:i/>
-                <w:color w:val="C00000"/>
-                <w:sz w:val="20"/>
-              </w:rPr>
-              <w:t>Institution</w:t>
-            </w:r>
-            <w:r>
-              <w:rPr>
-                <w:rFonts w:ascii="Times New Roman" w:hAnsi="Times New Roman" w:eastAsia="Times New Roman"/>
-                <w:i/>
-                <w:color w:val="C00000"/>
-                <w:sz w:val="20"/>
-              </w:rPr>
-              <w:t>]</w:t>
+              <w:t>and Business Systems</w:t>
             </w:r>
           </w:p>
           <w:p>
@@ -128,35 +85,48 @@
               <w:rPr>
                 <w:rFonts w:ascii="Times New Roman" w:hAnsi="Times New Roman" w:eastAsia="Times New Roman"/>
                 <w:i/>
-                <w:color w:val="C00000"/>
                 <w:sz w:val="20"/>
               </w:rPr>
-              <w:t xml:space="preserve">[TODO: </w:t>
+              <w:t>Mukesh Patel School of</w:t>
             </w:r>
-            <w:r>
-              <w:rPr>
-                <w:rFonts w:ascii="Times New Roman" w:hAnsi="Times New Roman" w:eastAsia="Times New Roman"/>
-                <w:i/>
-                <w:color w:val="C00000"/>
-                <w:sz w:val="20"/>
-              </w:rPr>
-              <w:t>City, Country</w:t>
-            </w:r>
-            <w:r>
-              <w:rPr>
-                <w:rFonts w:ascii="Times New Roman" w:hAnsi="Times New Roman" w:eastAsia="Times New Roman"/>
-                <w:i/>
-                <w:color w:val="C00000"/>
-                <w:sz w:val="20"/>
-              </w:rPr>
-              <w:t>]</w:t>
-            </w:r>
+          </w:p>
+          <w:p>
+            <w:pPr>
+              <w:jc w:val="center"/>
+            </w:pPr>
             <w:r>
               <w:rPr>
                 <w:rFonts w:ascii="Times New Roman" w:hAnsi="Times New Roman" w:eastAsia="Times New Roman"/>
                 <w:i/>
                 <w:sz w:val="20"/>
               </w:rPr>
+              <w:t>Technology Management</w:t>
+            </w:r>
+          </w:p>
+          <w:p>
+            <w:pPr>
+              <w:jc w:val="center"/>
+            </w:pPr>
+            <w:r>
+              <w:rPr>
+                <w:rFonts w:ascii="Times New Roman" w:hAnsi="Times New Roman" w:eastAsia="Times New Roman"/>
+                <w:i/>
+                <w:sz w:val="20"/>
+              </w:rPr>
+              <w:t>and Engineering, NMIMS</w:t>
+            </w:r>
+          </w:p>
+          <w:p>
+            <w:pPr>
+              <w:jc w:val="center"/>
+            </w:pPr>
+            <w:r>
+              <w:rPr>
+                <w:rFonts w:ascii="Times New Roman" w:hAnsi="Times New Roman" w:eastAsia="Times New Roman"/>
+                <w:i/>
+                <w:sz w:val="20"/>
+              </w:rPr>
+              <w:t>Mumbai, India</w:t>
             </w:r>
           </w:p>
           <w:p>
@@ -194,7 +164,7 @@
         </w:tc>
         <w:tc>
           <w:tcPr>
-            <w:tcW w:type="dxa" w:w="5220"/>
+            <w:tcW w:type="dxa" w:w="2610"/>
           </w:tcPr>
           <w:p>
             <w:pPr>
@@ -203,26 +173,87 @@
             <w:r>
               <w:rPr>
                 <w:rFonts w:ascii="Times New Roman" w:hAnsi="Times New Roman" w:eastAsia="Times New Roman"/>
-                <w:color w:val="C00000"/>
                 <w:sz w:val="22"/>
               </w:rPr>
-              <w:t xml:space="preserve">[TODO: </w:t>
+              <w:t>Manan Mehta</w:t>
             </w:r>
+          </w:p>
+          <w:p>
+            <w:pPr>
+              <w:jc w:val="center"/>
+            </w:pPr>
             <w:r>
               <w:rPr>
                 <w:rFonts w:ascii="Times New Roman" w:hAnsi="Times New Roman" w:eastAsia="Times New Roman"/>
-                <w:color w:val="C00000"/>
-                <w:sz w:val="22"/>
+                <w:i/>
+                <w:sz w:val="20"/>
               </w:rPr>
-              <w:t>Co-author / supervisor</w:t>
+              <w:t>Dept. of Computer Science</w:t>
             </w:r>
+          </w:p>
+          <w:p>
+            <w:pPr>
+              <w:jc w:val="center"/>
+            </w:pPr>
             <w:r>
               <w:rPr>
                 <w:rFonts w:ascii="Times New Roman" w:hAnsi="Times New Roman" w:eastAsia="Times New Roman"/>
-                <w:color w:val="C00000"/>
-                <w:sz w:val="22"/>
+                <w:i/>
+                <w:sz w:val="20"/>
               </w:rPr>
-              <w:t>]</w:t>
+              <w:t>and Business Systems</w:t>
+            </w:r>
+          </w:p>
+          <w:p>
+            <w:pPr>
+              <w:jc w:val="center"/>
+            </w:pPr>
+            <w:r>
+              <w:rPr>
+                <w:rFonts w:ascii="Times New Roman" w:hAnsi="Times New Roman" w:eastAsia="Times New Roman"/>
+                <w:i/>
+                <w:sz w:val="20"/>
+              </w:rPr>
+              <w:t>Mukesh Patel School of</w:t>
+            </w:r>
+          </w:p>
+          <w:p>
+            <w:pPr>
+              <w:jc w:val="center"/>
+            </w:pPr>
+            <w:r>
+              <w:rPr>
+                <w:rFonts w:ascii="Times New Roman" w:hAnsi="Times New Roman" w:eastAsia="Times New Roman"/>
+                <w:i/>
+                <w:sz w:val="20"/>
+              </w:rPr>
+              <w:t>Technology Management</w:t>
+            </w:r>
+          </w:p>
+          <w:p>
+            <w:pPr>
+              <w:jc w:val="center"/>
+            </w:pPr>
+            <w:r>
+              <w:rPr>
+                <w:rFonts w:ascii="Times New Roman" w:hAnsi="Times New Roman" w:eastAsia="Times New Roman"/>
+                <w:i/>
+                <w:sz w:val="20"/>
+              </w:rPr>
+              <w:t>and Engineering, NMIMS</w:t>
+            </w:r>
+          </w:p>
+          <w:p>
+            <w:pPr>
+              <w:jc w:val="center"/>
+            </w:pPr>
+            <w:r>
+              <w:rPr>
+                <w:rFonts w:ascii="Times New Roman" w:hAnsi="Times New Roman" w:eastAsia="Times New Roman"/>
+                <w:i/>
+                <w:sz w:val="20"/>
+              </w:rPr>
+              <w:t>Mumbai, India</w:t>
             </w:r>
           </w:p>
           <w:p>
@@ -245,7 +276,7 @@
                 <w:color w:val="C00000"/>
                 <w:sz w:val="20"/>
               </w:rPr>
-              <w:t>Department</w:t>
+              <w:t>email</w:t>
             </w:r>
             <w:r>
               <w:rPr>
@@ -256,12 +287,100 @@
               </w:rPr>
               <w:t>]</w:t>
             </w:r>
+          </w:p>
+        </w:tc>
+        <w:tc>
+          <w:tcPr>
+            <w:tcW w:type="dxa" w:w="2610"/>
+          </w:tcPr>
+          <w:p>
+            <w:pPr>
+              <w:jc w:val="center"/>
+            </w:pPr>
+            <w:r>
+              <w:rPr>
+                <w:rFonts w:ascii="Times New Roman" w:hAnsi="Times New Roman" w:eastAsia="Times New Roman"/>
+                <w:sz w:val="22"/>
+              </w:rPr>
+              <w:t>Soham Dwivedi</w:t>
+            </w:r>
+          </w:p>
+          <w:p>
+            <w:pPr>
+              <w:jc w:val="center"/>
+            </w:pPr>
             <w:r>
               <w:rPr>
                 <w:rFonts w:ascii="Times New Roman" w:hAnsi="Times New Roman" w:eastAsia="Times New Roman"/>
                 <w:i/>
                 <w:sz w:val="20"/>
               </w:rPr>
+              <w:t>Dept. of Computer Science</w:t>
+            </w:r>
+          </w:p>
+          <w:p>
+            <w:pPr>
+              <w:jc w:val="center"/>
+            </w:pPr>
+            <w:r>
+              <w:rPr>
+                <w:rFonts w:ascii="Times New Roman" w:hAnsi="Times New Roman" w:eastAsia="Times New Roman"/>
+                <w:i/>
+                <w:sz w:val="20"/>
+              </w:rPr>
+              <w:t>and Business Systems</w:t>
+            </w:r>
+          </w:p>
+          <w:p>
+            <w:pPr>
+              <w:jc w:val="center"/>
+            </w:pPr>
+            <w:r>
+              <w:rPr>
+                <w:rFonts w:ascii="Times New Roman" w:hAnsi="Times New Roman" w:eastAsia="Times New Roman"/>
+                <w:i/>
+                <w:sz w:val="20"/>
+              </w:rPr>
+              <w:t>Mukesh Patel School of</w:t>
+            </w:r>
+          </w:p>
+          <w:p>
+            <w:pPr>
+              <w:jc w:val="center"/>
+            </w:pPr>
+            <w:r>
+              <w:rPr>
+                <w:rFonts w:ascii="Times New Roman" w:hAnsi="Times New Roman" w:eastAsia="Times New Roman"/>
+                <w:i/>
+                <w:sz w:val="20"/>
+              </w:rPr>
+              <w:t>Technology Management</w:t>
+            </w:r>
+          </w:p>
+          <w:p>
+            <w:pPr>
+              <w:jc w:val="center"/>
+            </w:pPr>
+            <w:r>
+              <w:rPr>
+                <w:rFonts w:ascii="Times New Roman" w:hAnsi="Times New Roman" w:eastAsia="Times New Roman"/>
+                <w:i/>
+                <w:sz w:val="20"/>
+              </w:rPr>
+              <w:t>and Engineering, NMIMS</w:t>
+            </w:r>
+          </w:p>
+          <w:p>
+            <w:pPr>
+              <w:jc w:val="center"/>
+            </w:pPr>
+            <w:r>
+              <w:rPr>
+                <w:rFonts w:ascii="Times New Roman" w:hAnsi="Times New Roman" w:eastAsia="Times New Roman"/>
+                <w:i/>
+                <w:sz w:val="20"/>
+              </w:rPr>
+              <w:t>Mumbai, India</w:t>
             </w:r>
           </w:p>
           <w:p>
@@ -284,7 +403,7 @@
                 <w:color w:val="C00000"/>
                 <w:sz w:val="20"/>
               </w:rPr>
-              <w:t>Institution</w:t>
+              <w:t>email</w:t>
             </w:r>
             <w:r>
               <w:rPr>
@@ -296,6 +415,23 @@
               <w:t>]</w:t>
             </w:r>
           </w:p>
+        </w:tc>
+        <w:tc>
+          <w:tcPr>
+            <w:tcW w:type="dxa" w:w="2610"/>
+          </w:tcPr>
+          <w:p>
+            <w:pPr>
+              <w:jc w:val="center"/>
+            </w:pPr>
+            <w:r>
+              <w:rPr>
+                <w:rFonts w:ascii="Times New Roman" w:hAnsi="Times New Roman" w:eastAsia="Times New Roman"/>
+                <w:sz w:val="22"/>
+              </w:rPr>
+              <w:t>Aayusman Pati</w:t>
+            </w:r>
+          </w:p>
           <w:p>
             <w:pPr>
               <w:jc w:val="center"/>
@@ -304,35 +440,74 @@
               <w:rPr>
                 <w:rFonts w:ascii="Times New Roman" w:hAnsi="Times New Roman" w:eastAsia="Times New Roman"/>
                 <w:i/>
-                <w:color w:val="C00000"/>
                 <w:sz w:val="20"/>
               </w:rPr>
-              <w:t xml:space="preserve">[TODO: </w:t>
+              <w:t>Dept. of Computer Science</w:t>
             </w:r>
-            <w:r>
-              <w:rPr>
-                <w:rFonts w:ascii="Times New Roman" w:hAnsi="Times New Roman" w:eastAsia="Times New Roman"/>
-                <w:i/>
-                <w:color w:val="C00000"/>
-                <w:sz w:val="20"/>
-              </w:rPr>
-              <w:t>City, Country</w:t>
-            </w:r>
-            <w:r>
-              <w:rPr>
-                <w:rFonts w:ascii="Times New Roman" w:hAnsi="Times New Roman" w:eastAsia="Times New Roman"/>
-                <w:i/>
-                <w:color w:val="C00000"/>
-                <w:sz w:val="20"/>
-              </w:rPr>
-              <w:t>]</w:t>
-            </w:r>
+          </w:p>
+          <w:p>
+            <w:pPr>
+              <w:jc w:val="center"/>
+            </w:pPr>
             <w:r>
               <w:rPr>
                 <w:rFonts w:ascii="Times New Roman" w:hAnsi="Times New Roman" w:eastAsia="Times New Roman"/>
                 <w:i/>
                 <w:sz w:val="20"/>
               </w:rPr>
+              <w:t>and Business Systems</w:t>
+            </w:r>
+          </w:p>
+          <w:p>
+            <w:pPr>
+              <w:jc w:val="center"/>
+            </w:pPr>
+            <w:r>
+              <w:rPr>
+                <w:rFonts w:ascii="Times New Roman" w:hAnsi="Times New Roman" w:eastAsia="Times New Roman"/>
+                <w:i/>
+                <w:sz w:val="20"/>
+              </w:rPr>
+              <w:t>Mukesh Patel School of</w:t>
+            </w:r>
+          </w:p>
+          <w:p>
+            <w:pPr>
+              <w:jc w:val="center"/>
+            </w:pPr>
+            <w:r>
+              <w:rPr>
+                <w:rFonts w:ascii="Times New Roman" w:hAnsi="Times New Roman" w:eastAsia="Times New Roman"/>
+                <w:i/>
+                <w:sz w:val="20"/>
+              </w:rPr>
+              <w:t>Technology Management</w:t>
+            </w:r>
+          </w:p>
+          <w:p>
+            <w:pPr>
+              <w:jc w:val="center"/>
+            </w:pPr>
+            <w:r>
+              <w:rPr>
+                <w:rFonts w:ascii="Times New Roman" w:hAnsi="Times New Roman" w:eastAsia="Times New Roman"/>
+                <w:i/>
+                <w:sz w:val="20"/>
+              </w:rPr>
+              <w:t>and Engineering, NMIMS</w:t>
+            </w:r>
+          </w:p>
+          <w:p>
+            <w:pPr>
+              <w:jc w:val="center"/>
+            </w:pPr>
+            <w:r>
+              <w:rPr>
+                <w:rFonts w:ascii="Times New Roman" w:hAnsi="Times New Roman" w:eastAsia="Times New Roman"/>
+                <w:i/>
+                <w:sz w:val="20"/>
+              </w:rPr>
+              <w:t>Mumbai, India</w:t>
             </w:r>
           </w:p>
           <w:p>
@@ -415,7 +590,7 @@
           <w:b/>
           <w:sz w:val="18"/>
         </w:rPr>
-        <w:t xml:space="preserve">Meetings produce decisions, but the reasoning behind them—alternatives weighed, rationale, conditions and dissent—rarely survives into the written record. We study whether current AI can recover that reasoning and detect when a filed document has dropped it. We build EDIA, a pipeline that extracts structured decision reasoning from transcripts with an open 7B language model and flags reasoning elements missing from the accompanying document, and we evaluate it on </w:t>
+        <w:t xml:space="preserve">Meetings produce decisions, but the reasoning behind them—alternatives weighed, rationale, conditions and dissent—rarely survives into the written record. We study whether current AI can recover that reasoning and detect when a filed document has dropped it. We build EDIA (Explainable Decision Intelligence Assistant), a pipeline that extracts structured decision reasoning from transcripts with an open 7B language model and flags reasoning elements missing from the accompanying document, and we evaluate it on </w:t>
       </w:r>
       <w:r>
         <w:rPr>
@@ -612,7 +787,7 @@
           <w:rFonts w:ascii="Times New Roman" w:hAnsi="Times New Roman" w:eastAsia="Times New Roman"/>
           <w:sz w:val="20"/>
         </w:rPr>
-        <w:t>, an end-to-end pipeline for structured decision-reasoning extraction and gap detection, run entirely on open models.</w:t>
+        <w:t xml:space="preserve"> (Explainable Decision Intelligence Assistant), an end-to-end pipeline for structured decision-reasoning extraction and gap detection, run entirely on open models.</w:t>
       </w:r>
     </w:p>
     <w:p>
@@ -704,7 +879,7 @@
           <w:rFonts w:ascii="Times New Roman" w:hAnsi="Times New Roman" w:eastAsia="Times New Roman"/>
           <w:sz w:val="20"/>
         </w:rPr>
-        <w:t>: the pipeline recovers roughly a third to a half of the reasoning a human finds, and the remainder is precisely the reasoning that is hardest to locate.</w:t>
+        <w:t>: the pipeline recovers between a third and well over half of the reasoning a human finds (33–58%, depending on how strictly a match is judged), and the remainder is precisely the reasoning that is hardest to locate.</w:t>
       </w:r>
     </w:p>
     <w:p>
@@ -2213,7 +2388,7 @@
           <w:rFonts w:ascii="Times New Roman" w:hAnsi="Times New Roman" w:eastAsia="Times New Roman"/>
           <w:sz w:val="20"/>
         </w:rPr>
-        <w:t xml:space="preserve"> 139 pairs generated by Mistral 7B across 12 organisational domains and 10 decision archetypes. Labels are </w:t>
+        <w:t xml:space="preserve"> 139 pairs generated by Mistral 7B across 79 topics, covering 8 organisational domains and 10 decision archetypes. Labels are </w:t>
       </w:r>
       <w:r>
         <w:rPr>
@@ -7917,7 +8092,7 @@
           <w:rFonts w:ascii="Times New Roman" w:hAnsi="Times New Roman" w:eastAsia="Times New Roman"/>
           <w:sz w:val="20"/>
         </w:rPr>
-        <w:t xml:space="preserve"> The dominant misses are reasoning that is scattered or implicit. Neither longer context (no chunk-boundary misses) nor better answer-time reasoning (small CoT gain) addresses them, and neither entity-graph nor chained retrieval locates them. Progress likely requires methods that track a decision’s discourse across a whole meeting—linking later turns back to the proposal they respond to—before extraction, rather than retrieving by surface similarity.</w:t>
+        <w:t xml:space="preserve"> The dominant misses are reasoning that is scattered or implicit. Neither longer context (no chunk-boundary misses) nor better answer-time reasoning (CoT’s small recall gain is offset by lower precision) addresses them, and neither entity-graph nor chained retrieval locates them. Progress likely requires methods that track a decision’s discourse across a whole meeting—linking later turns back to the proposal they respond to—before extraction, rather than retrieving by surface similarity.</w:t>
       </w:r>
     </w:p>
     <w:p>
@@ -7939,31 +8114,7 @@
           <w:rFonts w:ascii="Times New Roman" w:hAnsi="Times New Roman" w:eastAsia="Times New Roman"/>
           <w:sz w:val="20"/>
         </w:rPr>
-        <w:t xml:space="preserve"> Completeness is reported on five hand-labelled Product meetings only. The corpus-wide run reports hallucination and verbatim-grounding rates across all three domains, which require no reasoning ground truth; we therefore cannot claim the completeness ceiling holds across domains, only that the objective grounding measures do. The corpus tier’s labels are NLI-produced and, given NLI’s weakness on present content, overstate the gap rate. The human spot-check is small: one annotator, 52 elements from three pairs, with no Product pair and no second annotator, so no inter-annotator agreement (Cohen’s kappa) is available and the estimated false-gap rate is imprecise. Synthetic transcripts are model-written and cleaner than real meetings. QMSum summaries stand in for filed decision records. All models are 7B-scale open models run locally; larger models may behave differently, and we leave that comparison to future work. </w:t>
-      </w:r>
-      <w:r>
-        <w:rPr>
-          <w:rFonts w:ascii="Times New Roman" w:hAnsi="Times New Roman" w:eastAsia="Times New Roman"/>
-          <w:color w:val="C00000"/>
-          <w:sz w:val="20"/>
-        </w:rPr>
-        <w:t xml:space="preserve">[TODO: </w:t>
-      </w:r>
-      <w:r>
-        <w:rPr>
-          <w:rFonts w:ascii="Times New Roman" w:hAnsi="Times New Roman" w:eastAsia="Times New Roman"/>
-          <w:color w:val="C00000"/>
-          <w:sz w:val="20"/>
-        </w:rPr>
-        <w:t>If applicable: cite the domain expert’s confirmation that multi-hop reasoning over meeting content is an open problem (e.g. as personal communication), or remove.</w:t>
-      </w:r>
-      <w:r>
-        <w:rPr>
-          <w:rFonts w:ascii="Times New Roman" w:hAnsi="Times New Roman" w:eastAsia="Times New Roman"/>
-          <w:color w:val="C00000"/>
-          <w:sz w:val="20"/>
-        </w:rPr>
-        <w:t>]</w:t>
+        <w:t xml:space="preserve"> Completeness is reported on five hand-labelled Product meetings only. The corpus-wide run reports hallucination and verbatim-grounding rates across all three domains, which require no reasoning ground truth; we therefore cannot claim the completeness ceiling holds across domains, only that the objective grounding measures do. The corpus tier’s labels are NLI-produced and, given NLI’s weakness on present content, overstate the gap rate. The human spot-check is small: one annotator, 52 elements from three pairs, with no Product pair and no second annotator, so no inter-annotator agreement (Cohen’s kappa) is available and the estimated false-gap rate is imprecise. Synthetic transcripts are model-written and cleaner than real meetings. QMSum summaries stand in for filed decision records. All models are 7B-scale open models run locally; larger models may behave differently, and we leave that comparison to future work.</w:t>
       </w:r>
     </w:p>
     <w:p>
@@ -8023,52 +8174,6 @@
           <w:sz w:val="20"/>
         </w:rPr>
         <w:t>Decision-context gap detection in enterprise meetings is partially achievable with current open models. A simple lexical detector outperforms NLI and an LLM judge at recognising which reasoning survived into a summary, and extraction recovers 33–58% of the reasoning a human identifies. The remainder is dominated by multi-hop reasoning scattered across distant turns or left implicit, and chain-of-thought, GraphRAG and multi-hop retrieval do not recover it. The ceiling is structural rather than an artefact of a particular method, and breaking it requires modelling how reasoning unfolds across an entire conversation.</w:t>
-      </w:r>
-    </w:p>
-    <w:p>
-      <w:pPr>
-        <w:keepNext/>
-        <w:spacing w:before="200" w:after="80" w:line="240" w:lineRule="auto"/>
-        <w:jc w:val="center"/>
-      </w:pPr>
-      <w:r>
-        <w:rPr>
-          <w:rFonts w:ascii="Times New Roman" w:hAnsi="Times New Roman" w:eastAsia="Times New Roman"/>
-          <w:smallCaps/>
-          <w:sz w:val="20"/>
-        </w:rPr>
-        <w:t>Acknowledgment</w:t>
-      </w:r>
-    </w:p>
-    <w:p>
-      <w:pPr>
-        <w:spacing w:before="0" w:after="0" w:line="240" w:lineRule="auto"/>
-        <w:ind w:firstLine="200"/>
-        <w:jc w:val="both"/>
-      </w:pPr>
-      <w:r>
-        <w:rPr>
-          <w:rFonts w:ascii="Times New Roman" w:hAnsi="Times New Roman" w:eastAsia="Times New Roman"/>
-          <w:color w:val="C00000"/>
-          <w:sz w:val="20"/>
-        </w:rPr>
-        <w:t xml:space="preserve">[TODO: </w:t>
-      </w:r>
-      <w:r>
-        <w:rPr>
-          <w:rFonts w:ascii="Times New Roman" w:hAnsi="Times New Roman" w:eastAsia="Times New Roman"/>
-          <w:color w:val="C00000"/>
-          <w:sz w:val="20"/>
-        </w:rPr>
-        <w:t>Acknowledge supervisors, the domain expert, and compute resources, or remove.</w:t>
-      </w:r>
-      <w:r>
-        <w:rPr>
-          <w:rFonts w:ascii="Times New Roman" w:hAnsi="Times New Roman" w:eastAsia="Times New Roman"/>
-          <w:color w:val="C00000"/>
-          <w:sz w:val="20"/>
-        </w:rPr>
-        <w:t>]</w:t>
       </w:r>
     </w:p>
     <w:p>
@@ -8177,7 +8282,7 @@
           <w:rFonts w:ascii="Times New Roman" w:hAnsi="Times New Roman" w:eastAsia="Times New Roman"/>
           <w:sz w:val="16"/>
         </w:rPr>
-        <w:t>, 2003.</w:t>
+        <w:t>, 2003, pp. I-364–I-367.</w:t>
       </w:r>
     </w:p>
     <w:p>
@@ -8278,7 +8383,7 @@
           <w:rFonts w:ascii="Times New Roman" w:hAnsi="Times New Roman" w:eastAsia="Times New Roman"/>
           <w:sz w:val="16"/>
         </w:rPr>
-        <w:t>, 2018.</w:t>
+        <w:t>, 2018, pp. 1112–1122.</w:t>
       </w:r>
     </w:p>
     <w:p>
@@ -8405,7 +8510,7 @@
           <w:rFonts w:ascii="Times New Roman" w:hAnsi="Times New Roman" w:eastAsia="Times New Roman"/>
           <w:sz w:val="16"/>
         </w:rPr>
-        <w:t>, 2020.</w:t>
+        <w:t>, 2020, pp. 9332–9346.</w:t>
       </w:r>
     </w:p>
     <w:p>
@@ -8499,7 +8604,7 @@
           <w:rFonts w:ascii="Times New Roman" w:hAnsi="Times New Roman" w:eastAsia="Times New Roman"/>
           <w:sz w:val="16"/>
         </w:rPr>
-        <w:t>, 2020.</w:t>
+        <w:t>, 2020, pp. 9459–9474.</w:t>
       </w:r>
     </w:p>
     <w:p>
@@ -8546,7 +8651,7 @@
           <w:rFonts w:ascii="Times New Roman" w:hAnsi="Times New Roman" w:eastAsia="Times New Roman"/>
           <w:sz w:val="16"/>
         </w:rPr>
-        <w:t>, 2018.</w:t>
+        <w:t>, 2018, pp. 2369–2380.</w:t>
       </w:r>
     </w:p>
     <w:p>
@@ -8633,7 +8738,7 @@
           <w:rFonts w:ascii="Times New Roman" w:hAnsi="Times New Roman" w:eastAsia="Times New Roman"/>
           <w:sz w:val="16"/>
         </w:rPr>
-        <w:t>, 2022.</w:t>
+        <w:t>, 2022, pp. 24824–24837.</w:t>
       </w:r>
     </w:p>
     <w:p>
@@ -8720,7 +8825,7 @@
           <w:rFonts w:ascii="Times New Roman" w:hAnsi="Times New Roman" w:eastAsia="Times New Roman"/>
           <w:sz w:val="16"/>
         </w:rPr>
-        <w:t>, 2019.</w:t>
+        <w:t>, 2019, pp. 3982–3992.</w:t>
       </w:r>
     </w:p>
     <w:sectPr>

</xml_diff>

<commit_message>
Prepare the repository for submission: README, stale claims, hygiene
README rewritten (what the project is, main results, layout, setup, reproduction
commands that were each re-run from the committed data, measurement choices,
limitations, data licensing). Fixed text that contradicted the paper: the dataset
card's placeholder note, a calibration note that called a model review the real
validation, and the project plan's retired 47% figure and assistant-addressed
instructions. spotcheck_report.py now writes a report named after the folder it
reads, so scoring the human sample cannot overwrite the model-review report;
run_cot_ablation.py no longer crashes on a cp1252 console. IEEE draft: removed the
four placeholder e-mail markers. .gitignore now covers the report files and run
logs so they cannot be committed by accident.
</commit_message>
<xml_diff>
--- a/paper/edia_ieee.docx
+++ b/paper/edia_ieee.docx
@@ -112,33 +112,6 @@
     <w:p>
       <w:pPr>
         <w:pStyle w:val="Author"/>
-        <w:spacing w:before="0" w:after="0"/>
-      </w:pPr>
-      <w:r>
-        <w:rPr>
-          <w:color w:val="C00000"/>
-          <w:sz w:val="18"/>
-        </w:rPr>
-        <w:t xml:space="preserve">[TODO: </w:t>
-      </w:r>
-      <w:r>
-        <w:rPr>
-          <w:color w:val="C00000"/>
-          <w:sz w:val="18"/>
-        </w:rPr>
-        <w:t>email</w:t>
-      </w:r>
-      <w:r>
-        <w:rPr>
-          <w:color w:val="C00000"/>
-          <w:sz w:val="18"/>
-        </w:rPr>
-        <w:t>]</w:t>
-      </w:r>
-    </w:p>
-    <w:p>
-      <w:pPr>
-        <w:pStyle w:val="Author"/>
         <w:spacing w:before="120"/>
       </w:pPr>
       <w:r>
@@ -224,33 +197,6 @@
           <w:sz w:val="18"/>
         </w:rPr>
         <w:t>Mumbai, India</w:t>
-      </w:r>
-    </w:p>
-    <w:p>
-      <w:pPr>
-        <w:pStyle w:val="Author"/>
-        <w:spacing w:before="0" w:after="0"/>
-      </w:pPr>
-      <w:r>
-        <w:rPr>
-          <w:color w:val="C00000"/>
-          <w:sz w:val="18"/>
-        </w:rPr>
-        <w:t xml:space="preserve">[TODO: </w:t>
-      </w:r>
-      <w:r>
-        <w:rPr>
-          <w:color w:val="C00000"/>
-          <w:sz w:val="18"/>
-        </w:rPr>
-        <w:t>email</w:t>
-      </w:r>
-      <w:r>
-        <w:rPr>
-          <w:color w:val="C00000"/>
-          <w:sz w:val="18"/>
-        </w:rPr>
-        <w:t>]</w:t>
       </w:r>
     </w:p>
     <w:p>
@@ -346,33 +292,6 @@
     <w:p>
       <w:pPr>
         <w:pStyle w:val="Author"/>
-        <w:spacing w:before="0" w:after="0"/>
-      </w:pPr>
-      <w:r>
-        <w:rPr>
-          <w:color w:val="C00000"/>
-          <w:sz w:val="18"/>
-        </w:rPr>
-        <w:t xml:space="preserve">[TODO: </w:t>
-      </w:r>
-      <w:r>
-        <w:rPr>
-          <w:color w:val="C00000"/>
-          <w:sz w:val="18"/>
-        </w:rPr>
-        <w:t>email</w:t>
-      </w:r>
-      <w:r>
-        <w:rPr>
-          <w:color w:val="C00000"/>
-          <w:sz w:val="18"/>
-        </w:rPr>
-        <w:t>]</w:t>
-      </w:r>
-    </w:p>
-    <w:p>
-      <w:pPr>
-        <w:pStyle w:val="Author"/>
         <w:spacing w:before="120"/>
       </w:pPr>
       <w:r>
@@ -458,33 +377,6 @@
           <w:sz w:val="18"/>
         </w:rPr>
         <w:t>Mumbai, India</w:t>
-      </w:r>
-    </w:p>
-    <w:p>
-      <w:pPr>
-        <w:pStyle w:val="Author"/>
-        <w:spacing w:before="0" w:after="0"/>
-      </w:pPr>
-      <w:r>
-        <w:rPr>
-          <w:color w:val="C00000"/>
-          <w:sz w:val="18"/>
-        </w:rPr>
-        <w:t xml:space="preserve">[TODO: </w:t>
-      </w:r>
-      <w:r>
-        <w:rPr>
-          <w:color w:val="C00000"/>
-          <w:sz w:val="18"/>
-        </w:rPr>
-        <w:t>email</w:t>
-      </w:r>
-      <w:r>
-        <w:rPr>
-          <w:color w:val="C00000"/>
-          <w:sz w:val="18"/>
-        </w:rPr>
-        <w:t>]</w:t>
       </w:r>
     </w:p>
     <w:p>

</xml_diff>